<commit_message>
feat: enhance project documentation and define Firebase Authentication as the identity provider
</commit_message>
<xml_diff>
--- a/project_details/scope/Phase 1 questions_v2.docx
+++ b/project_details/scope/Phase 1 questions_v2.docx
@@ -171,6 +171,12 @@
                 <w:rFonts w:ascii="Aptos" w:hAnsi="Aptos"/>
               </w:rPr>
             </w:pPr>
+            <w:r>
+              <w:rPr>
+                <w:rFonts w:ascii="Aptos" w:hAnsi="Aptos"/>
+              </w:rPr>
+              <w:t>In progress of creation</w:t>
+            </w:r>
           </w:p>
         </w:tc>
       </w:tr>
@@ -215,6 +221,12 @@
                 <w:rFonts w:ascii="Aptos" w:hAnsi="Aptos"/>
               </w:rPr>
             </w:pPr>
+            <w:r>
+              <w:rPr>
+                <w:rFonts w:ascii="Aptos" w:hAnsi="Aptos"/>
+              </w:rPr>
+              <w:t>TBD</w:t>
+            </w:r>
           </w:p>
         </w:tc>
       </w:tr>
@@ -262,6 +274,12 @@
                 <w:rFonts w:ascii="Aptos" w:hAnsi="Aptos"/>
               </w:rPr>
             </w:pPr>
+            <w:r>
+              <w:rPr>
+                <w:rFonts w:ascii="Aptos" w:hAnsi="Aptos"/>
+              </w:rPr>
+              <w:t>Yes</w:t>
+            </w:r>
           </w:p>
         </w:tc>
       </w:tr>
@@ -348,6 +366,24 @@
                 <w:rFonts w:ascii="Aptos" w:hAnsi="Aptos"/>
               </w:rPr>
             </w:pPr>
+            <w:r>
+              <w:rPr>
+                <w:rFonts w:ascii="Aptos" w:hAnsi="Aptos"/>
+              </w:rPr>
+              <w:t xml:space="preserve">Date of initial </w:t>
+            </w:r>
+            <w:r>
+              <w:rPr>
+                <w:rFonts w:ascii="Aptos" w:hAnsi="Aptos"/>
+              </w:rPr>
+              <w:t xml:space="preserve">sandbox </w:t>
+            </w:r>
+            <w:r>
+              <w:rPr>
+                <w:rFonts w:ascii="Aptos" w:hAnsi="Aptos"/>
+              </w:rPr>
+              <w:t>API deploy</w:t>
+            </w:r>
           </w:p>
         </w:tc>
       </w:tr>
@@ -395,6 +431,12 @@
                 <w:rFonts w:ascii="Aptos" w:hAnsi="Aptos"/>
               </w:rPr>
             </w:pPr>
+            <w:r>
+              <w:rPr>
+                <w:rFonts w:ascii="Aptos" w:hAnsi="Aptos"/>
+              </w:rPr>
+              <w:t>Yes</w:t>
+            </w:r>
           </w:p>
         </w:tc>
       </w:tr>
@@ -543,6 +585,12 @@
                 <w:rFonts w:ascii="Aptos" w:hAnsi="Aptos"/>
               </w:rPr>
             </w:pPr>
+            <w:r>
+              <w:rPr>
+                <w:rFonts w:ascii="Aptos" w:hAnsi="Aptos"/>
+              </w:rPr>
+              <w:t>Oauth2</w:t>
+            </w:r>
           </w:p>
         </w:tc>
       </w:tr>
@@ -587,6 +635,12 @@
                 <w:rFonts w:ascii="Aptos" w:hAnsi="Aptos"/>
               </w:rPr>
             </w:pPr>
+            <w:r>
+              <w:rPr>
+                <w:rFonts w:ascii="Aptos" w:hAnsi="Aptos"/>
+              </w:rPr>
+              <w:t>Email/password</w:t>
+            </w:r>
           </w:p>
         </w:tc>
       </w:tr>
@@ -634,6 +688,12 @@
                 <w:rFonts w:ascii="Aptos" w:hAnsi="Aptos"/>
               </w:rPr>
             </w:pPr>
+            <w:r>
+              <w:rPr>
+                <w:rFonts w:ascii="Aptos" w:hAnsi="Aptos"/>
+              </w:rPr>
+              <w:t>OICD token with name, id, role</w:t>
+            </w:r>
           </w:p>
         </w:tc>
       </w:tr>
@@ -678,6 +738,12 @@
                 <w:rFonts w:ascii="Aptos" w:hAnsi="Aptos"/>
               </w:rPr>
             </w:pPr>
+            <w:r>
+              <w:rPr>
+                <w:rFonts w:ascii="Aptos" w:hAnsi="Aptos"/>
+              </w:rPr>
+              <w:t>4</w:t>
+            </w:r>
           </w:p>
         </w:tc>
       </w:tr>
@@ -725,6 +791,12 @@
                 <w:rFonts w:ascii="Aptos" w:hAnsi="Aptos"/>
               </w:rPr>
             </w:pPr>
+            <w:r>
+              <w:rPr>
+                <w:rFonts w:ascii="Aptos" w:hAnsi="Aptos"/>
+              </w:rPr>
+              <w:t>Silently refresh</w:t>
+            </w:r>
           </w:p>
         </w:tc>
       </w:tr>
@@ -777,6 +849,12 @@
                 <w:rFonts w:ascii="Aptos" w:hAnsi="Aptos"/>
               </w:rPr>
             </w:pPr>
+            <w:r>
+              <w:rPr>
+                <w:rFonts w:ascii="Aptos" w:hAnsi="Aptos"/>
+              </w:rPr>
+              <w:t>Correct</w:t>
+            </w:r>
           </w:p>
         </w:tc>
       </w:tr>
@@ -824,6 +902,12 @@
                 <w:rFonts w:ascii="Aptos" w:hAnsi="Aptos"/>
               </w:rPr>
             </w:pPr>
+            <w:r>
+              <w:rPr>
+                <w:rFonts w:ascii="Aptos" w:hAnsi="Aptos"/>
+              </w:rPr>
+              <w:t>Generic auth failure error message</w:t>
+            </w:r>
           </w:p>
         </w:tc>
       </w:tr>
@@ -868,6 +952,20 @@
                 <w:rFonts w:ascii="Aptos" w:hAnsi="Aptos"/>
               </w:rPr>
             </w:pPr>
+            <w:r>
+              <w:rPr>
+                <w:rFonts w:ascii="Aptos" w:hAnsi="Aptos"/>
+              </w:rPr>
+              <w:t xml:space="preserve">Not </w:t>
+            </w:r>
+            <w:proofErr w:type="gramStart"/>
+            <w:r>
+              <w:rPr>
+                <w:rFonts w:ascii="Aptos" w:hAnsi="Aptos"/>
+              </w:rPr>
+              <w:t>at this time</w:t>
+            </w:r>
+            <w:proofErr w:type="gramEnd"/>
           </w:p>
         </w:tc>
       </w:tr>
@@ -1088,6 +1186,12 @@
                 <w:rFonts w:ascii="Aptos" w:hAnsi="Aptos"/>
               </w:rPr>
             </w:pPr>
+            <w:r>
+              <w:rPr>
+                <w:rFonts w:ascii="Aptos" w:hAnsi="Aptos"/>
+              </w:rPr>
+              <w:t>OICD token with name, id, role</w:t>
+            </w:r>
           </w:p>
         </w:tc>
       </w:tr>
@@ -1132,6 +1236,12 @@
                 <w:rFonts w:ascii="Aptos" w:hAnsi="Aptos"/>
               </w:rPr>
             </w:pPr>
+            <w:r>
+              <w:rPr>
+                <w:rFonts w:ascii="Aptos" w:hAnsi="Aptos"/>
+              </w:rPr>
+              <w:t>“Monitor”, “Supervisor”, “Admin”</w:t>
+            </w:r>
           </w:p>
         </w:tc>
       </w:tr>
@@ -1179,6 +1289,12 @@
                 <w:rFonts w:ascii="Aptos" w:hAnsi="Aptos"/>
               </w:rPr>
             </w:pPr>
+            <w:r>
+              <w:rPr>
+                <w:rFonts w:ascii="Aptos" w:hAnsi="Aptos"/>
+              </w:rPr>
+              <w:t>No, Admin must have Supervisor and Monitor capabilities, and Supervisor must have Monito capabilities</w:t>
+            </w:r>
           </w:p>
         </w:tc>
       </w:tr>
@@ -1336,6 +1452,12 @@
                 <w:rFonts w:ascii="Aptos" w:hAnsi="Aptos"/>
               </w:rPr>
             </w:pPr>
+            <w:r>
+              <w:rPr>
+                <w:rFonts w:ascii="Aptos" w:hAnsi="Aptos"/>
+              </w:rPr>
+              <w:t>Checklist is hardcoded in app in case of connectivity problems</w:t>
+            </w:r>
           </w:p>
         </w:tc>
       </w:tr>
@@ -1380,6 +1502,12 @@
                 <w:rFonts w:ascii="Aptos" w:hAnsi="Aptos"/>
               </w:rPr>
             </w:pPr>
+            <w:r>
+              <w:rPr>
+                <w:rFonts w:ascii="Aptos" w:hAnsi="Aptos"/>
+              </w:rPr>
+              <w:t>N/A</w:t>
+            </w:r>
           </w:p>
         </w:tc>
       </w:tr>
@@ -1427,6 +1555,12 @@
                 <w:rFonts w:ascii="Aptos" w:hAnsi="Aptos"/>
               </w:rPr>
             </w:pPr>
+            <w:r>
+              <w:rPr>
+                <w:rFonts w:ascii="Aptos" w:hAnsi="Aptos"/>
+              </w:rPr>
+              <w:t>Correct</w:t>
+            </w:r>
           </w:p>
         </w:tc>
       </w:tr>
@@ -1471,6 +1605,12 @@
                 <w:rFonts w:ascii="Aptos" w:hAnsi="Aptos"/>
               </w:rPr>
             </w:pPr>
+            <w:r>
+              <w:rPr>
+                <w:rFonts w:ascii="Aptos" w:hAnsi="Aptos"/>
+              </w:rPr>
+              <w:t>Correct</w:t>
+            </w:r>
           </w:p>
         </w:tc>
       </w:tr>
@@ -1552,6 +1692,12 @@
                 <w:rFonts w:ascii="Aptos" w:hAnsi="Aptos"/>
               </w:rPr>
             </w:pPr>
+            <w:r>
+              <w:rPr>
+                <w:rFonts w:ascii="Aptos" w:hAnsi="Aptos"/>
+              </w:rPr>
+              <w:t>Comment is mandatory, photo is optional/recommended</w:t>
+            </w:r>
           </w:p>
         </w:tc>
       </w:tr>
@@ -1596,6 +1742,12 @@
                 <w:rFonts w:ascii="Aptos" w:hAnsi="Aptos"/>
               </w:rPr>
             </w:pPr>
+            <w:r>
+              <w:rPr>
+                <w:rFonts w:ascii="Aptos" w:hAnsi="Aptos"/>
+              </w:rPr>
+              <w:t>User scans vehicle license disc</w:t>
+            </w:r>
           </w:p>
         </w:tc>
       </w:tr>
@@ -1643,6 +1795,24 @@
                 <w:rFonts w:ascii="Aptos" w:hAnsi="Aptos"/>
               </w:rPr>
             </w:pPr>
+            <w:r>
+              <w:rPr>
+                <w:rFonts w:ascii="Aptos" w:hAnsi="Aptos"/>
+              </w:rPr>
+              <w:t xml:space="preserve">App must provide </w:t>
+            </w:r>
+            <w:r>
+              <w:rPr>
+                <w:rFonts w:ascii="Aptos" w:hAnsi="Aptos"/>
+              </w:rPr>
+              <w:t xml:space="preserve">scanned </w:t>
+            </w:r>
+            <w:r>
+              <w:rPr>
+                <w:rFonts w:ascii="Aptos" w:hAnsi="Aptos"/>
+              </w:rPr>
+              <w:t>vin as identifier for bus</w:t>
+            </w:r>
           </w:p>
         </w:tc>
       </w:tr>
@@ -1687,6 +1857,12 @@
                 <w:rFonts w:ascii="Aptos" w:hAnsi="Aptos"/>
               </w:rPr>
             </w:pPr>
+            <w:r>
+              <w:rPr>
+                <w:rFonts w:ascii="Aptos" w:hAnsi="Aptos"/>
+              </w:rPr>
+              <w:t>Yes</w:t>
+            </w:r>
           </w:p>
         </w:tc>
       </w:tr>
@@ -1829,6 +2005,12 @@
                 <w:rFonts w:ascii="Aptos" w:hAnsi="Aptos"/>
               </w:rPr>
             </w:pPr>
+            <w:r>
+              <w:rPr>
+                <w:rFonts w:ascii="Aptos" w:hAnsi="Aptos"/>
+              </w:rPr>
+              <w:t>Include Bus id, exclude direction of travel, trip id</w:t>
+            </w:r>
           </w:p>
         </w:tc>
       </w:tr>
@@ -1873,6 +2055,12 @@
                 <w:rFonts w:ascii="Aptos" w:hAnsi="Aptos"/>
               </w:rPr>
             </w:pPr>
+            <w:r>
+              <w:rPr>
+                <w:rFonts w:ascii="Aptos" w:hAnsi="Aptos"/>
+              </w:rPr>
+              <w:t>Free text capture of route number form bus route-plate</w:t>
+            </w:r>
           </w:p>
         </w:tc>
       </w:tr>
@@ -1938,6 +2126,12 @@
                 <w:rFonts w:ascii="Aptos" w:hAnsi="Aptos"/>
               </w:rPr>
             </w:pPr>
+            <w:r>
+              <w:rPr>
+                <w:rFonts w:ascii="Aptos" w:hAnsi="Aptos"/>
+              </w:rPr>
+              <w:t>No</w:t>
+            </w:r>
           </w:p>
         </w:tc>
       </w:tr>
@@ -1967,6 +2161,7 @@
                 <w:b w:val="0"/>
                 <w:bCs w:val="0"/>
               </w:rPr>
+              <w:lastRenderedPageBreak/>
               <w:t>Is there a separate API endpoint for passenger counts, or does it form part of the inspection submission?</w:t>
             </w:r>
           </w:p>
@@ -1982,6 +2177,12 @@
                 <w:rFonts w:ascii="Aptos" w:hAnsi="Aptos"/>
               </w:rPr>
             </w:pPr>
+            <w:r>
+              <w:rPr>
+                <w:rFonts w:ascii="Aptos" w:hAnsi="Aptos"/>
+              </w:rPr>
+              <w:t>Separate API endpoint for counts in case inspection is not completed</w:t>
+            </w:r>
           </w:p>
         </w:tc>
       </w:tr>
@@ -2014,7 +2215,6 @@
                 <w:b w:val="0"/>
                 <w:bCs w:val="0"/>
               </w:rPr>
-              <w:lastRenderedPageBreak/>
               <w:t>What does a Point of Interest (POI) look like in your data — do you send us a list of POIs per route, and what fields do they have?</w:t>
             </w:r>
           </w:p>
@@ -2030,6 +2230,20 @@
                 <w:rFonts w:ascii="Aptos" w:hAnsi="Aptos"/>
               </w:rPr>
             </w:pPr>
+            <w:r>
+              <w:rPr>
+                <w:rFonts w:ascii="Aptos" w:hAnsi="Aptos"/>
+              </w:rPr>
+              <w:t xml:space="preserve">No in-app requirement for </w:t>
+            </w:r>
+            <w:proofErr w:type="spellStart"/>
+            <w:r>
+              <w:rPr>
+                <w:rFonts w:ascii="Aptos" w:hAnsi="Aptos"/>
+              </w:rPr>
+              <w:t>PoI’s</w:t>
+            </w:r>
+            <w:proofErr w:type="spellEnd"/>
           </w:p>
         </w:tc>
       </w:tr>
@@ -2190,6 +2404,12 @@
                 <w:rFonts w:ascii="Aptos" w:hAnsi="Aptos"/>
               </w:rPr>
             </w:pPr>
+            <w:r>
+              <w:rPr>
+                <w:rFonts w:ascii="Aptos" w:hAnsi="Aptos"/>
+              </w:rPr>
+              <w:t>Yes, delayed packages are allowed when containing the data capture timestamp</w:t>
+            </w:r>
           </w:p>
         </w:tc>
       </w:tr>
@@ -2258,6 +2478,12 @@
                 <w:rFonts w:ascii="Aptos" w:hAnsi="Aptos"/>
               </w:rPr>
             </w:pPr>
+            <w:r>
+              <w:rPr>
+                <w:rFonts w:ascii="Aptos" w:hAnsi="Aptos"/>
+              </w:rPr>
+              <w:t>Yes</w:t>
+            </w:r>
           </w:p>
         </w:tc>
       </w:tr>
@@ -2305,6 +2531,18 @@
                 <w:rFonts w:ascii="Aptos" w:hAnsi="Aptos"/>
               </w:rPr>
             </w:pPr>
+            <w:r>
+              <w:rPr>
+                <w:rFonts w:ascii="Aptos" w:hAnsi="Aptos"/>
+              </w:rPr>
+              <w:t>Send both</w:t>
+            </w:r>
+            <w:r>
+              <w:rPr>
+                <w:rFonts w:ascii="Aptos" w:hAnsi="Aptos"/>
+              </w:rPr>
+              <w:t xml:space="preserve"> when devices are online again</w:t>
+            </w:r>
           </w:p>
         </w:tc>
       </w:tr>
@@ -2445,6 +2683,12 @@
                 <w:rFonts w:ascii="Aptos" w:hAnsi="Aptos"/>
               </w:rPr>
             </w:pPr>
+            <w:r>
+              <w:rPr>
+                <w:rFonts w:ascii="Aptos" w:hAnsi="Aptos"/>
+              </w:rPr>
+              <w:t>Yes</w:t>
+            </w:r>
           </w:p>
         </w:tc>
       </w:tr>
@@ -2480,8 +2724,8 @@
         <w:tblLook w:val="04A0" w:firstRow="1" w:lastRow="0" w:firstColumn="1" w:lastColumn="0" w:noHBand="0" w:noVBand="1"/>
       </w:tblPr>
       <w:tblGrid>
-        <w:gridCol w:w="6941"/>
-        <w:gridCol w:w="3515"/>
+        <w:gridCol w:w="6877"/>
+        <w:gridCol w:w="3579"/>
       </w:tblGrid>
       <w:tr>
         <w:trPr>
@@ -2570,6 +2814,20 @@
                 <w:rFonts w:ascii="Aptos" w:hAnsi="Aptos"/>
               </w:rPr>
             </w:pPr>
+            <w:proofErr w:type="spellStart"/>
+            <w:r>
+              <w:rPr>
+                <w:rFonts w:ascii="Aptos" w:hAnsi="Aptos"/>
+              </w:rPr>
+              <w:t>Erlo</w:t>
+            </w:r>
+            <w:proofErr w:type="spellEnd"/>
+            <w:r>
+              <w:rPr>
+                <w:rFonts w:ascii="Aptos" w:hAnsi="Aptos"/>
+              </w:rPr>
+              <w:t xml:space="preserve"> (erlo.conradie@macrocomm.co.za)</w:t>
+            </w:r>
           </w:p>
         </w:tc>
       </w:tr>
@@ -2614,6 +2872,12 @@
                 <w:rFonts w:ascii="Aptos" w:hAnsi="Aptos"/>
               </w:rPr>
             </w:pPr>
+            <w:r>
+              <w:rPr>
+                <w:rFonts w:ascii="Aptos" w:hAnsi="Aptos"/>
+              </w:rPr>
+              <w:t>4 hours</w:t>
+            </w:r>
           </w:p>
         </w:tc>
       </w:tr>
@@ -2677,6 +2941,12 @@
                 <w:rFonts w:ascii="Aptos" w:hAnsi="Aptos"/>
               </w:rPr>
             </w:pPr>
+            <w:r>
+              <w:rPr>
+                <w:rFonts w:ascii="Aptos" w:hAnsi="Aptos"/>
+              </w:rPr>
+              <w:t>Email</w:t>
+            </w:r>
           </w:p>
         </w:tc>
       </w:tr>
@@ -2699,7 +2969,7 @@
           <w:rFonts w:ascii="Aptos" w:hAnsi="Aptos"/>
         </w:rPr>
         <w:pict w14:anchorId="70EAA607">
-          <v:rect id="_x0000_i1033" style="width:0;height:1.5pt" o:hralign="center" o:bullet="t" o:hrstd="t" o:hr="t" fillcolor="#a0a0a0" stroked="f"/>
+          <v:rect id="_x0000_i1032" style="width:0;height:1.5pt" o:hralign="center" o:bullet="t" o:hrstd="t" o:hr="t" fillcolor="#a0a0a0" stroked="f"/>
         </w:pict>
       </w:r>
     </w:p>
@@ -2931,6 +3201,7 @@
                 <w:b w:val="0"/>
                 <w:bCs w:val="0"/>
               </w:rPr>
+              <w:lastRenderedPageBreak/>
               <w:t>Select route</w:t>
             </w:r>
             <w:r>
@@ -2993,7 +3264,6 @@
                 <w:b w:val="0"/>
                 <w:bCs w:val="0"/>
               </w:rPr>
-              <w:lastRenderedPageBreak/>
               <w:t xml:space="preserve">List of inspections for the day. </w:t>
             </w:r>
           </w:p>
@@ -3099,6 +3369,79 @@
                 <w:rFonts w:ascii="Aptos" w:hAnsi="Aptos"/>
               </w:rPr>
             </w:pPr>
+            <w:r>
+              <w:rPr>
+                <w:rFonts w:ascii="Aptos" w:hAnsi="Aptos"/>
+              </w:rPr>
+              <w:lastRenderedPageBreak/>
+              <w:t xml:space="preserve">‘Select </w:t>
+            </w:r>
+            <w:proofErr w:type="spellStart"/>
+            <w:r>
+              <w:rPr>
+                <w:rFonts w:ascii="Aptos" w:hAnsi="Aptos"/>
+              </w:rPr>
+              <w:t>Bus’</w:t>
+            </w:r>
+            <w:proofErr w:type="spellEnd"/>
+            <w:r>
+              <w:rPr>
+                <w:rFonts w:ascii="Aptos" w:hAnsi="Aptos"/>
+              </w:rPr>
+              <w:t xml:space="preserve"> would be ‘Scan </w:t>
+            </w:r>
+            <w:proofErr w:type="spellStart"/>
+            <w:r>
+              <w:rPr>
+                <w:rFonts w:ascii="Aptos" w:hAnsi="Aptos"/>
+              </w:rPr>
+              <w:t>Bus’</w:t>
+            </w:r>
+            <w:proofErr w:type="spellEnd"/>
+            <w:r>
+              <w:rPr>
+                <w:rFonts w:ascii="Aptos" w:hAnsi="Aptos"/>
+              </w:rPr>
+              <w:t xml:space="preserve"> to scan the vehicle license disc</w:t>
+            </w:r>
+            <w:r>
+              <w:rPr>
+                <w:rFonts w:ascii="Aptos" w:hAnsi="Aptos"/>
+              </w:rPr>
+              <w:t>.</w:t>
+            </w:r>
+            <w:r>
+              <w:rPr>
+                <w:rFonts w:ascii="Aptos" w:hAnsi="Aptos"/>
+              </w:rPr>
+              <w:br/>
+            </w:r>
+            <w:r>
+              <w:rPr>
+                <w:rFonts w:ascii="Aptos" w:hAnsi="Aptos"/>
+              </w:rPr>
+              <w:br/>
+              <w:t>‘Select Route’ would become ‘Input Route’.</w:t>
+            </w:r>
+            <w:r>
+              <w:rPr>
+                <w:rFonts w:ascii="Aptos" w:hAnsi="Aptos"/>
+              </w:rPr>
+              <w:br/>
+            </w:r>
+            <w:r>
+              <w:rPr>
+                <w:rFonts w:ascii="Aptos" w:hAnsi="Aptos"/>
+              </w:rPr>
+              <w:br/>
+            </w:r>
+            <w:r>
+              <w:rPr>
+                <w:rFonts w:ascii="Aptos" w:hAnsi="Aptos"/>
+              </w:rPr>
+              <w:lastRenderedPageBreak/>
+              <w:t>No requirement for ‘List of Inspections’ or historical inspections.</w:t>
+            </w:r>
           </w:p>
         </w:tc>
       </w:tr>
@@ -3125,15 +3468,7 @@
                 <w:b w:val="0"/>
                 <w:bCs w:val="0"/>
               </w:rPr>
-              <w:t>U</w:t>
-            </w:r>
-            <w:r>
-              <w:rPr>
-                <w:rFonts w:ascii="Aptos" w:hAnsi="Aptos"/>
-                <w:b w:val="0"/>
-                <w:bCs w:val="0"/>
-              </w:rPr>
-              <w:t>ser picks a bus and route</w:t>
+              <w:t>User picks a bus and route</w:t>
             </w:r>
             <w:r>
               <w:rPr>
@@ -3628,6 +3963,40 @@
                 <w:rFonts w:ascii="Aptos" w:hAnsi="Aptos"/>
               </w:rPr>
             </w:pPr>
+            <w:r>
+              <w:rPr>
+                <w:rFonts w:ascii="Aptos" w:hAnsi="Aptos"/>
+              </w:rPr>
+              <w:t xml:space="preserve">No </w:t>
+            </w:r>
+            <w:proofErr w:type="spellStart"/>
+            <w:r>
+              <w:rPr>
+                <w:rFonts w:ascii="Aptos" w:hAnsi="Aptos"/>
+              </w:rPr>
+              <w:t>PoI</w:t>
+            </w:r>
+            <w:proofErr w:type="spellEnd"/>
+            <w:r>
+              <w:rPr>
+                <w:rFonts w:ascii="Aptos" w:hAnsi="Aptos"/>
+              </w:rPr>
+              <w:t xml:space="preserve"> input required.  Capture count at the point of count.  Count package contains timestamp and </w:t>
+            </w:r>
+            <w:proofErr w:type="spellStart"/>
+            <w:r>
+              <w:rPr>
+                <w:rFonts w:ascii="Aptos" w:hAnsi="Aptos"/>
+              </w:rPr>
+              <w:t>gps</w:t>
+            </w:r>
+            <w:proofErr w:type="spellEnd"/>
+            <w:r>
+              <w:rPr>
+                <w:rFonts w:ascii="Aptos" w:hAnsi="Aptos"/>
+              </w:rPr>
+              <w:t xml:space="preserve"> location.</w:t>
+            </w:r>
           </w:p>
         </w:tc>
       </w:tr>
@@ -3753,6 +4122,26 @@
                 <w:rFonts w:ascii="Aptos" w:hAnsi="Aptos"/>
               </w:rPr>
             </w:pPr>
+            <w:r>
+              <w:rPr>
+                <w:rFonts w:ascii="Aptos" w:hAnsi="Aptos"/>
+              </w:rPr>
+              <w:t xml:space="preserve">No requirement to list completed counts or add new </w:t>
+            </w:r>
+            <w:proofErr w:type="spellStart"/>
+            <w:r>
+              <w:rPr>
+                <w:rFonts w:ascii="Aptos" w:hAnsi="Aptos"/>
+              </w:rPr>
+              <w:t>PoI</w:t>
+            </w:r>
+            <w:proofErr w:type="spellEnd"/>
+            <w:r>
+              <w:rPr>
+                <w:rFonts w:ascii="Aptos" w:hAnsi="Aptos"/>
+              </w:rPr>
+              <w:t xml:space="preserve"> count</w:t>
+            </w:r>
           </w:p>
         </w:tc>
       </w:tr>
@@ -8681,14 +9070,71 @@
 
 <file path=customXml/item1.xml><?xml version="1.0" encoding="utf-8"?>
 <?mso-contentType ?>
-<FormTemplates xmlns="http://schemas.microsoft.com/sharepoint/v3/contenttype/forms">
-  <Display>DocumentLibraryForm</Display>
-  <Edit>DocumentLibraryForm</Edit>
-  <New>DocumentLibraryForm</New>
-</FormTemplates>
+<spe:Receivers xmlns:spe="http://schemas.microsoft.com/sharepoint/events">
+  <Receiver>
+    <Name>Document ID Generator</Name>
+    <Synchronization>Synchronous</Synchronization>
+    <Type>10001</Type>
+    <SequenceNumber>1000</SequenceNumber>
+    <Url/>
+    <Assembly>Microsoft.Office.DocumentManagement, Version=16.0.0.0, Culture=neutral, PublicKeyToken=71e9bce111e9429c</Assembly>
+    <Class>Microsoft.Office.DocumentManagement.Internal.DocIdHandler</Class>
+    <Data/>
+    <Filter/>
+  </Receiver>
+  <Receiver>
+    <Name>Document ID Generator</Name>
+    <Synchronization>Synchronous</Synchronization>
+    <Type>10002</Type>
+    <SequenceNumber>1001</SequenceNumber>
+    <Url/>
+    <Assembly>Microsoft.Office.DocumentManagement, Version=16.0.0.0, Culture=neutral, PublicKeyToken=71e9bce111e9429c</Assembly>
+    <Class>Microsoft.Office.DocumentManagement.Internal.DocIdHandler</Class>
+    <Data/>
+    <Filter/>
+  </Receiver>
+  <Receiver>
+    <Name>Document ID Generator</Name>
+    <Synchronization>Synchronous</Synchronization>
+    <Type>10004</Type>
+    <SequenceNumber>1002</SequenceNumber>
+    <Url/>
+    <Assembly>Microsoft.Office.DocumentManagement, Version=16.0.0.0, Culture=neutral, PublicKeyToken=71e9bce111e9429c</Assembly>
+    <Class>Microsoft.Office.DocumentManagement.Internal.DocIdHandler</Class>
+    <Data/>
+    <Filter/>
+  </Receiver>
+  <Receiver>
+    <Name>Document ID Generator</Name>
+    <Synchronization>Synchronous</Synchronization>
+    <Type>10006</Type>
+    <SequenceNumber>1003</SequenceNumber>
+    <Url/>
+    <Assembly>Microsoft.Office.DocumentManagement, Version=16.0.0.0, Culture=neutral, PublicKeyToken=71e9bce111e9429c</Assembly>
+    <Class>Microsoft.Office.DocumentManagement.Internal.DocIdHandler</Class>
+    <Data/>
+    <Filter/>
+  </Receiver>
+</spe:Receivers>
 </file>
 
 <file path=customXml/item2.xml><?xml version="1.0" encoding="utf-8"?>
+<p:properties xmlns:p="http://schemas.microsoft.com/office/2006/metadata/properties" xmlns:xsi="http://www.w3.org/2001/XMLSchema-instance" xmlns:pc="http://schemas.microsoft.com/office/infopath/2007/PartnerControls">
+  <documentManagement>
+    <lcf76f155ced4ddcb4097134ff3c332f xmlns="e81fdd25-8d50-4693-8928-866cadbb6473">
+      <Terms xmlns="http://schemas.microsoft.com/office/infopath/2007/PartnerControls"/>
+    </lcf76f155ced4ddcb4097134ff3c332f>
+    <TaxCatchAll xmlns="99a63c41-766b-46eb-b3c9-b967d66ecc6e" xsi:nil="true"/>
+    <_dlc_DocId xmlns="99a63c41-766b-46eb-b3c9-b967d66ecc6e">HTC74WK34Y6Z-875996804-556145</_dlc_DocId>
+    <_dlc_DocIdUrl xmlns="99a63c41-766b-46eb-b3c9-b967d66ecc6e">
+      <Url>https://praxislive.sharepoint.com/sites/CommonDrive/_layouts/15/DocIdRedir.aspx?ID=HTC74WK34Y6Z-875996804-556145</Url>
+      <Description>HTC74WK34Y6Z-875996804-556145</Description>
+    </_dlc_DocIdUrl>
+  </documentManagement>
+</p:properties>
+</file>
+
+<file path=customXml/item3.xml><?xml version="1.0" encoding="utf-8"?>
 <ct:contentTypeSchema xmlns:ct="http://schemas.microsoft.com/office/2006/metadata/contentType" xmlns:ma="http://schemas.microsoft.com/office/2006/metadata/properties/metaAttributes" ct:_="" ma:_="" ma:contentTypeName="Document" ma:contentTypeID="0x01010053DB08D7AF4A674CA2039EE2734FC9B8" ma:contentTypeVersion="18" ma:contentTypeDescription="Create a new document." ma:contentTypeScope="" ma:versionID="14e4ec881bf4cc84f0b539c51508f831">
   <xsd:schema xmlns:xsd="http://www.w3.org/2001/XMLSchema" xmlns:xs="http://www.w3.org/2001/XMLSchema" xmlns:p="http://schemas.microsoft.com/office/2006/metadata/properties" xmlns:ns2="99a63c41-766b-46eb-b3c9-b967d66ecc6e" xmlns:ns3="e81fdd25-8d50-4693-8928-866cadbb6473" targetNamespace="http://schemas.microsoft.com/office/2006/metadata/properties" ma:root="true" ma:fieldsID="89f007958de7ccb77bb42217fae42332" ns2:_="" ns3:_="">
     <xsd:import namespace="99a63c41-766b-46eb-b3c9-b967d66ecc6e"/>
@@ -8968,81 +9414,35 @@
 </ct:contentTypeSchema>
 </file>
 
-<file path=customXml/item3.xml><?xml version="1.0" encoding="utf-8"?>
-<p:properties xmlns:p="http://schemas.microsoft.com/office/2006/metadata/properties" xmlns:xsi="http://www.w3.org/2001/XMLSchema-instance" xmlns:pc="http://schemas.microsoft.com/office/infopath/2007/PartnerControls">
-  <documentManagement>
-    <lcf76f155ced4ddcb4097134ff3c332f xmlns="e81fdd25-8d50-4693-8928-866cadbb6473">
-      <Terms xmlns="http://schemas.microsoft.com/office/infopath/2007/PartnerControls"/>
-    </lcf76f155ced4ddcb4097134ff3c332f>
-    <TaxCatchAll xmlns="99a63c41-766b-46eb-b3c9-b967d66ecc6e" xsi:nil="true"/>
-    <_dlc_DocId xmlns="99a63c41-766b-46eb-b3c9-b967d66ecc6e">HTC74WK34Y6Z-875996804-556145</_dlc_DocId>
-    <_dlc_DocIdUrl xmlns="99a63c41-766b-46eb-b3c9-b967d66ecc6e">
-      <Url>https://praxislive.sharepoint.com/sites/CommonDrive/_layouts/15/DocIdRedir.aspx?ID=HTC74WK34Y6Z-875996804-556145</Url>
-      <Description>HTC74WK34Y6Z-875996804-556145</Description>
-    </_dlc_DocIdUrl>
-  </documentManagement>
-</p:properties>
-</file>
-
 <file path=customXml/item4.xml><?xml version="1.0" encoding="utf-8"?>
 <?mso-contentType ?>
-<spe:Receivers xmlns:spe="http://schemas.microsoft.com/sharepoint/events">
-  <Receiver>
-    <Name>Document ID Generator</Name>
-    <Synchronization>Synchronous</Synchronization>
-    <Type>10001</Type>
-    <SequenceNumber>1000</SequenceNumber>
-    <Url/>
-    <Assembly>Microsoft.Office.DocumentManagement, Version=16.0.0.0, Culture=neutral, PublicKeyToken=71e9bce111e9429c</Assembly>
-    <Class>Microsoft.Office.DocumentManagement.Internal.DocIdHandler</Class>
-    <Data/>
-    <Filter/>
-  </Receiver>
-  <Receiver>
-    <Name>Document ID Generator</Name>
-    <Synchronization>Synchronous</Synchronization>
-    <Type>10002</Type>
-    <SequenceNumber>1001</SequenceNumber>
-    <Url/>
-    <Assembly>Microsoft.Office.DocumentManagement, Version=16.0.0.0, Culture=neutral, PublicKeyToken=71e9bce111e9429c</Assembly>
-    <Class>Microsoft.Office.DocumentManagement.Internal.DocIdHandler</Class>
-    <Data/>
-    <Filter/>
-  </Receiver>
-  <Receiver>
-    <Name>Document ID Generator</Name>
-    <Synchronization>Synchronous</Synchronization>
-    <Type>10004</Type>
-    <SequenceNumber>1002</SequenceNumber>
-    <Url/>
-    <Assembly>Microsoft.Office.DocumentManagement, Version=16.0.0.0, Culture=neutral, PublicKeyToken=71e9bce111e9429c</Assembly>
-    <Class>Microsoft.Office.DocumentManagement.Internal.DocIdHandler</Class>
-    <Data/>
-    <Filter/>
-  </Receiver>
-  <Receiver>
-    <Name>Document ID Generator</Name>
-    <Synchronization>Synchronous</Synchronization>
-    <Type>10006</Type>
-    <SequenceNumber>1003</SequenceNumber>
-    <Url/>
-    <Assembly>Microsoft.Office.DocumentManagement, Version=16.0.0.0, Culture=neutral, PublicKeyToken=71e9bce111e9429c</Assembly>
-    <Class>Microsoft.Office.DocumentManagement.Internal.DocIdHandler</Class>
-    <Data/>
-    <Filter/>
-  </Receiver>
-</spe:Receivers>
+<FormTemplates xmlns="http://schemas.microsoft.com/sharepoint/v3/contenttype/forms">
+  <Display>DocumentLibraryForm</Display>
+  <Edit>DocumentLibraryForm</Edit>
+  <New>DocumentLibraryForm</New>
+</FormTemplates>
 </file>
 
 <file path=customXml/itemProps1.xml><?xml version="1.0" encoding="utf-8"?>
-<ds:datastoreItem xmlns:ds="http://schemas.openxmlformats.org/officeDocument/2006/customXml" ds:itemID="{FD4F5256-6E28-4CCB-834C-79500FC4F806}">
+<ds:datastoreItem xmlns:ds="http://schemas.openxmlformats.org/officeDocument/2006/customXml" ds:itemID="{8A77EA18-553E-4F7A-A054-92D399634892}">
   <ds:schemaRefs>
-    <ds:schemaRef ds:uri="http://schemas.microsoft.com/sharepoint/v3/contenttype/forms"/>
+    <ds:schemaRef ds:uri="http://schemas.microsoft.com/sharepoint/events"/>
   </ds:schemaRefs>
 </ds:datastoreItem>
 </file>
 
 <file path=customXml/itemProps2.xml><?xml version="1.0" encoding="utf-8"?>
+<ds:datastoreItem xmlns:ds="http://schemas.openxmlformats.org/officeDocument/2006/customXml" ds:itemID="{3F6BBC2E-00D0-41B4-A692-A924ED7BF0F3}">
+  <ds:schemaRefs>
+    <ds:schemaRef ds:uri="http://schemas.microsoft.com/office/2006/metadata/properties"/>
+    <ds:schemaRef ds:uri="http://schemas.microsoft.com/office/infopath/2007/PartnerControls"/>
+    <ds:schemaRef ds:uri="e81fdd25-8d50-4693-8928-866cadbb6473"/>
+    <ds:schemaRef ds:uri="99a63c41-766b-46eb-b3c9-b967d66ecc6e"/>
+  </ds:schemaRefs>
+</ds:datastoreItem>
+</file>
+
+<file path=customXml/itemProps3.xml><?xml version="1.0" encoding="utf-8"?>
 <ds:datastoreItem xmlns:ds="http://schemas.openxmlformats.org/officeDocument/2006/customXml" ds:itemID="{30E107A1-0A4E-4E4E-BA74-95CC4AC79C30}">
   <ds:schemaRefs>
     <ds:schemaRef ds:uri="http://schemas.microsoft.com/office/2006/metadata/contentType"/>
@@ -9061,21 +9461,10 @@
 </ds:datastoreItem>
 </file>
 
-<file path=customXml/itemProps3.xml><?xml version="1.0" encoding="utf-8"?>
-<ds:datastoreItem xmlns:ds="http://schemas.openxmlformats.org/officeDocument/2006/customXml" ds:itemID="{3F6BBC2E-00D0-41B4-A692-A924ED7BF0F3}">
+<file path=customXml/itemProps4.xml><?xml version="1.0" encoding="utf-8"?>
+<ds:datastoreItem xmlns:ds="http://schemas.openxmlformats.org/officeDocument/2006/customXml" ds:itemID="{FD4F5256-6E28-4CCB-834C-79500FC4F806}">
   <ds:schemaRefs>
-    <ds:schemaRef ds:uri="http://schemas.microsoft.com/office/2006/metadata/properties"/>
-    <ds:schemaRef ds:uri="http://schemas.microsoft.com/office/infopath/2007/PartnerControls"/>
-    <ds:schemaRef ds:uri="e81fdd25-8d50-4693-8928-866cadbb6473"/>
-    <ds:schemaRef ds:uri="99a63c41-766b-46eb-b3c9-b967d66ecc6e"/>
-  </ds:schemaRefs>
-</ds:datastoreItem>
-</file>
-
-<file path=customXml/itemProps4.xml><?xml version="1.0" encoding="utf-8"?>
-<ds:datastoreItem xmlns:ds="http://schemas.openxmlformats.org/officeDocument/2006/customXml" ds:itemID="{8A77EA18-553E-4F7A-A054-92D399634892}">
-  <ds:schemaRefs>
-    <ds:schemaRef ds:uri="http://schemas.microsoft.com/sharepoint/events"/>
+    <ds:schemaRef ds:uri="http://schemas.microsoft.com/sharepoint/v3/contenttype/forms"/>
   </ds:schemaRefs>
 </ds:datastoreItem>
 </file>
</xml_diff>